<commit_message>
edge detection + segmentation
</commit_message>
<xml_diff>
--- a/docs/log-tien-do/log-tien-do-sprint.docx
+++ b/docs/log-tien-do/log-tien-do-sprint.docx
@@ -65,7 +65,7 @@
           <w:sz w:val="28"/>
           <w:szCs w:val="28"/>
         </w:rPr>
-        <w:t>SPRINT 1 — CUỐI TUẦN 2  (Chuẩn bị &amp; Research</w:t>
+        <w:t>SPRINT 1 — (Chuẩn bị &amp; Research</w:t>
       </w:r>
       <w:r>
         <w:rPr>
@@ -85,6 +85,16 @@
           <w:sz w:val="28"/>
           <w:szCs w:val="28"/>
         </w:rPr>
+        <w:t xml:space="preserve"> &amp; H</w:t>
+      </w:r>
+      <w:r>
+        <w:rPr>
+          <w:b/>
+          <w:bCs/>
+          <w:color w:val="6C5DD3"/>
+          <w:sz w:val="28"/>
+          <w:szCs w:val="28"/>
+        </w:rPr>
         <w:t>)</w:t>
       </w:r>
     </w:p>
@@ -193,12 +203,14 @@
       <w:r>
         <w:t xml:space="preserve">Camera </w:t>
       </w:r>
+      <w:proofErr w:type="gramStart"/>
       <w:r>
         <w:t xml:space="preserve">calibration </w:t>
       </w:r>
       <w:r>
         <w:t>:</w:t>
       </w:r>
+      <w:proofErr w:type="gramEnd"/>
     </w:p>
     <w:p>
       <w:pPr>
@@ -573,6 +585,7 @@
         <w:rPr>
           <w:i/>
           <w:iCs/>
+          <w:noProof/>
           <w:color w:val="8388A3"/>
           <w:sz w:val="21"/>
           <w:szCs w:val="21"/>
@@ -1148,7 +1161,25 @@
         <w:sz w:val="16"/>
         <w:szCs w:val="16"/>
       </w:rPr>
-      <w:t xml:space="preserve">CVFP26BCPPRJC039 · Nhóm CVF25PRJ12 · Log tiến độ  —  </w:t>
+      <w:t xml:space="preserve">CVFP26BCPPRJC039 · Nhóm CVF25PRJ12 · Log tiến </w:t>
+    </w:r>
+    <w:proofErr w:type="gramStart"/>
+    <w:r>
+      <w:rPr>
+        <w:color w:val="8388A3"/>
+        <w:sz w:val="16"/>
+        <w:szCs w:val="16"/>
+      </w:rPr>
+      <w:t>độ  —</w:t>
+    </w:r>
+    <w:proofErr w:type="gramEnd"/>
+    <w:r>
+      <w:rPr>
+        <w:color w:val="8388A3"/>
+        <w:sz w:val="16"/>
+        <w:szCs w:val="16"/>
+      </w:rPr>
+      <w:t xml:space="preserve">  </w:t>
     </w:r>
     <w:r>
       <w:rPr>
@@ -2097,6 +2128,7 @@
   <w:style w:type="character" w:default="1" w:styleId="DefaultParagraphFont">
     <w:name w:val="Default Paragraph Font"/>
     <w:uiPriority w:val="1"/>
+    <w:semiHidden/>
     <w:unhideWhenUsed/>
   </w:style>
   <w:style w:type="table" w:default="1" w:styleId="TableNormal">

</xml_diff>